<commit_message>
Update Algorithms used for encryption - SHA2, MD5, CRC32.docx
</commit_message>
<xml_diff>
--- a/Algorithms used for encryption - SHA2, MD5, CRC32.docx
+++ b/Algorithms used for encryption - SHA2, MD5, CRC32.docx
@@ -939,33 +939,23 @@
     </w:p>
     <w:tbl>
       <w:tblPr>
+        <w:tblStyle w:val="TableGrid"/>
         <w:tblW w:w="0" w:type="auto"/>
-        <w:tblCellSpacing w:w="15" w:type="dxa"/>
-        <w:tblCellMar>
-          <w:top w:w="15" w:type="dxa"/>
-          <w:left w:w="15" w:type="dxa"/>
-          <w:bottom w:w="15" w:type="dxa"/>
-          <w:right w:w="15" w:type="dxa"/>
-        </w:tblCellMar>
         <w:tblLook w:val="04A0" w:firstRow="1" w:lastRow="0" w:firstColumn="1" w:lastColumn="0" w:noHBand="0" w:noVBand="1"/>
       </w:tblPr>
       <w:tblGrid>
-        <w:gridCol w:w="989"/>
-        <w:gridCol w:w="1340"/>
+        <w:gridCol w:w="1130"/>
+        <w:gridCol w:w="1481"/>
       </w:tblGrid>
       <w:tr>
-        <w:trPr>
-          <w:tblHeader/>
-          <w:tblCellSpacing w:w="15" w:type="dxa"/>
-        </w:trPr>
-        <w:tc>
-          <w:tcPr>
-            <w:tcW w:w="0" w:type="auto"/>
-            <w:vAlign w:val="center"/>
-            <w:hideMark/>
-          </w:tcPr>
-          <w:p>
-            <w:pPr>
+        <w:tc>
+          <w:tcPr>
+            <w:tcW w:w="0" w:type="auto"/>
+            <w:hideMark/>
+          </w:tcPr>
+          <w:p>
+            <w:pPr>
+              <w:spacing w:after="160" w:line="278" w:lineRule="auto"/>
               <w:rPr>
                 <w:b/>
                 <w:bCs/>
@@ -984,11 +974,11 @@
         <w:tc>
           <w:tcPr>
             <w:tcW w:w="0" w:type="auto"/>
-            <w:vAlign w:val="center"/>
-            <w:hideMark/>
-          </w:tcPr>
-          <w:p>
-            <w:pPr>
+            <w:hideMark/>
+          </w:tcPr>
+          <w:p>
+            <w:pPr>
+              <w:spacing w:after="160" w:line="278" w:lineRule="auto"/>
               <w:rPr>
                 <w:b/>
                 <w:bCs/>
@@ -1005,16 +995,15 @@
         </w:tc>
       </w:tr>
       <w:tr>
-        <w:trPr>
-          <w:tblCellSpacing w:w="15" w:type="dxa"/>
-        </w:trPr>
-        <w:tc>
-          <w:tcPr>
-            <w:tcW w:w="0" w:type="auto"/>
-            <w:vAlign w:val="center"/>
-            <w:hideMark/>
-          </w:tcPr>
-          <w:p>
+        <w:tc>
+          <w:tcPr>
+            <w:tcW w:w="0" w:type="auto"/>
+            <w:hideMark/>
+          </w:tcPr>
+          <w:p>
+            <w:pPr>
+              <w:spacing w:after="160" w:line="278" w:lineRule="auto"/>
+            </w:pPr>
             <w:r>
               <w:t>SHA-224</w:t>
             </w:r>
@@ -1023,10 +1012,12 @@
         <w:tc>
           <w:tcPr>
             <w:tcW w:w="0" w:type="auto"/>
-            <w:vAlign w:val="center"/>
-            <w:hideMark/>
-          </w:tcPr>
-          <w:p>
+            <w:hideMark/>
+          </w:tcPr>
+          <w:p>
+            <w:pPr>
+              <w:spacing w:after="160" w:line="278" w:lineRule="auto"/>
+            </w:pPr>
             <w:r>
               <w:t>224 bits</w:t>
             </w:r>
@@ -1034,16 +1025,15 @@
         </w:tc>
       </w:tr>
       <w:tr>
-        <w:trPr>
-          <w:tblCellSpacing w:w="15" w:type="dxa"/>
-        </w:trPr>
-        <w:tc>
-          <w:tcPr>
-            <w:tcW w:w="0" w:type="auto"/>
-            <w:vAlign w:val="center"/>
-            <w:hideMark/>
-          </w:tcPr>
-          <w:p>
+        <w:tc>
+          <w:tcPr>
+            <w:tcW w:w="0" w:type="auto"/>
+            <w:hideMark/>
+          </w:tcPr>
+          <w:p>
+            <w:pPr>
+              <w:spacing w:after="160" w:line="278" w:lineRule="auto"/>
+            </w:pPr>
             <w:r>
               <w:t>SHA-256</w:t>
             </w:r>
@@ -1052,10 +1042,12 @@
         <w:tc>
           <w:tcPr>
             <w:tcW w:w="0" w:type="auto"/>
-            <w:vAlign w:val="center"/>
-            <w:hideMark/>
-          </w:tcPr>
-          <w:p>
+            <w:hideMark/>
+          </w:tcPr>
+          <w:p>
+            <w:pPr>
+              <w:spacing w:after="160" w:line="278" w:lineRule="auto"/>
+            </w:pPr>
             <w:r>
               <w:t>256 bits</w:t>
             </w:r>
@@ -1063,16 +1055,15 @@
         </w:tc>
       </w:tr>
       <w:tr>
-        <w:trPr>
-          <w:tblCellSpacing w:w="15" w:type="dxa"/>
-        </w:trPr>
-        <w:tc>
-          <w:tcPr>
-            <w:tcW w:w="0" w:type="auto"/>
-            <w:vAlign w:val="center"/>
-            <w:hideMark/>
-          </w:tcPr>
-          <w:p>
+        <w:tc>
+          <w:tcPr>
+            <w:tcW w:w="0" w:type="auto"/>
+            <w:hideMark/>
+          </w:tcPr>
+          <w:p>
+            <w:pPr>
+              <w:spacing w:after="160" w:line="278" w:lineRule="auto"/>
+            </w:pPr>
             <w:r>
               <w:t>SHA-384</w:t>
             </w:r>
@@ -1081,10 +1072,12 @@
         <w:tc>
           <w:tcPr>
             <w:tcW w:w="0" w:type="auto"/>
-            <w:vAlign w:val="center"/>
-            <w:hideMark/>
-          </w:tcPr>
-          <w:p>
+            <w:hideMark/>
+          </w:tcPr>
+          <w:p>
+            <w:pPr>
+              <w:spacing w:after="160" w:line="278" w:lineRule="auto"/>
+            </w:pPr>
             <w:r>
               <w:t>384 bits</w:t>
             </w:r>
@@ -1092,16 +1085,15 @@
         </w:tc>
       </w:tr>
       <w:tr>
-        <w:trPr>
-          <w:tblCellSpacing w:w="15" w:type="dxa"/>
-        </w:trPr>
-        <w:tc>
-          <w:tcPr>
-            <w:tcW w:w="0" w:type="auto"/>
-            <w:vAlign w:val="center"/>
-            <w:hideMark/>
-          </w:tcPr>
-          <w:p>
+        <w:tc>
+          <w:tcPr>
+            <w:tcW w:w="0" w:type="auto"/>
+            <w:hideMark/>
+          </w:tcPr>
+          <w:p>
+            <w:pPr>
+              <w:spacing w:after="160" w:line="278" w:lineRule="auto"/>
+            </w:pPr>
             <w:r>
               <w:t>SHA-512</w:t>
             </w:r>
@@ -1110,10 +1102,12 @@
         <w:tc>
           <w:tcPr>
             <w:tcW w:w="0" w:type="auto"/>
-            <w:vAlign w:val="center"/>
-            <w:hideMark/>
-          </w:tcPr>
-          <w:p>
+            <w:hideMark/>
+          </w:tcPr>
+          <w:p>
+            <w:pPr>
+              <w:spacing w:after="160" w:line="278" w:lineRule="auto"/>
+            </w:pPr>
             <w:r>
               <w:t>512 bits</w:t>
             </w:r>
@@ -1236,33 +1230,23 @@
     </w:p>
     <w:tbl>
       <w:tblPr>
+        <w:tblStyle w:val="TableGrid"/>
         <w:tblW w:w="0" w:type="auto"/>
-        <w:tblCellSpacing w:w="15" w:type="dxa"/>
-        <w:tblCellMar>
-          <w:top w:w="15" w:type="dxa"/>
-          <w:left w:w="15" w:type="dxa"/>
-          <w:bottom w:w="15" w:type="dxa"/>
-          <w:right w:w="15" w:type="dxa"/>
-        </w:tblCellMar>
         <w:tblLook w:val="04A0" w:firstRow="1" w:lastRow="0" w:firstColumn="1" w:lastColumn="0" w:noHBand="0" w:noVBand="1"/>
       </w:tblPr>
       <w:tblGrid>
-        <w:gridCol w:w="2015"/>
-        <w:gridCol w:w="747"/>
+        <w:gridCol w:w="2156"/>
+        <w:gridCol w:w="888"/>
       </w:tblGrid>
       <w:tr>
-        <w:trPr>
-          <w:tblHeader/>
-          <w:tblCellSpacing w:w="15" w:type="dxa"/>
-        </w:trPr>
-        <w:tc>
-          <w:tcPr>
-            <w:tcW w:w="0" w:type="auto"/>
-            <w:vAlign w:val="center"/>
-            <w:hideMark/>
-          </w:tcPr>
-          <w:p>
-            <w:pPr>
+        <w:tc>
+          <w:tcPr>
+            <w:tcW w:w="0" w:type="auto"/>
+            <w:hideMark/>
+          </w:tcPr>
+          <w:p>
+            <w:pPr>
+              <w:spacing w:after="160" w:line="278" w:lineRule="auto"/>
               <w:rPr>
                 <w:b/>
                 <w:bCs/>
@@ -1280,11 +1264,11 @@
         <w:tc>
           <w:tcPr>
             <w:tcW w:w="0" w:type="auto"/>
-            <w:vAlign w:val="center"/>
-            <w:hideMark/>
-          </w:tcPr>
-          <w:p>
-            <w:pPr>
+            <w:hideMark/>
+          </w:tcPr>
+          <w:p>
+            <w:pPr>
+              <w:spacing w:after="160" w:line="278" w:lineRule="auto"/>
               <w:rPr>
                 <w:b/>
                 <w:bCs/>
@@ -1301,16 +1285,15 @@
         </w:tc>
       </w:tr>
       <w:tr>
-        <w:trPr>
-          <w:tblCellSpacing w:w="15" w:type="dxa"/>
-        </w:trPr>
-        <w:tc>
-          <w:tcPr>
-            <w:tcW w:w="0" w:type="auto"/>
-            <w:vAlign w:val="center"/>
-            <w:hideMark/>
-          </w:tcPr>
-          <w:p>
+        <w:tc>
+          <w:tcPr>
+            <w:tcW w:w="0" w:type="auto"/>
+            <w:hideMark/>
+          </w:tcPr>
+          <w:p>
+            <w:pPr>
+              <w:spacing w:after="160" w:line="278" w:lineRule="auto"/>
+            </w:pPr>
             <w:r>
               <w:t>Secure</w:t>
             </w:r>
@@ -1319,10 +1302,12 @@
         <w:tc>
           <w:tcPr>
             <w:tcW w:w="0" w:type="auto"/>
-            <w:vAlign w:val="center"/>
-            <w:hideMark/>
-          </w:tcPr>
-          <w:p>
+            <w:hideMark/>
+          </w:tcPr>
+          <w:p>
+            <w:pPr>
+              <w:spacing w:after="160" w:line="278" w:lineRule="auto"/>
+            </w:pPr>
             <w:r>
               <w:t>Yes</w:t>
             </w:r>
@@ -1330,16 +1315,15 @@
         </w:tc>
       </w:tr>
       <w:tr>
-        <w:trPr>
-          <w:tblCellSpacing w:w="15" w:type="dxa"/>
-        </w:trPr>
-        <w:tc>
-          <w:tcPr>
-            <w:tcW w:w="0" w:type="auto"/>
-            <w:vAlign w:val="center"/>
-            <w:hideMark/>
-          </w:tcPr>
-          <w:p>
+        <w:tc>
+          <w:tcPr>
+            <w:tcW w:w="0" w:type="auto"/>
+            <w:hideMark/>
+          </w:tcPr>
+          <w:p>
+            <w:pPr>
+              <w:spacing w:after="160" w:line="278" w:lineRule="auto"/>
+            </w:pPr>
             <w:r>
               <w:t>Reversible</w:t>
             </w:r>
@@ -1348,10 +1332,12 @@
         <w:tc>
           <w:tcPr>
             <w:tcW w:w="0" w:type="auto"/>
-            <w:vAlign w:val="center"/>
-            <w:hideMark/>
-          </w:tcPr>
-          <w:p>
+            <w:hideMark/>
+          </w:tcPr>
+          <w:p>
+            <w:pPr>
+              <w:spacing w:after="160" w:line="278" w:lineRule="auto"/>
+            </w:pPr>
             <w:r>
               <w:t>No</w:t>
             </w:r>
@@ -1359,16 +1345,15 @@
         </w:tc>
       </w:tr>
       <w:tr>
-        <w:trPr>
-          <w:tblCellSpacing w:w="15" w:type="dxa"/>
-        </w:trPr>
-        <w:tc>
-          <w:tcPr>
-            <w:tcW w:w="0" w:type="auto"/>
-            <w:vAlign w:val="center"/>
-            <w:hideMark/>
-          </w:tcPr>
-          <w:p>
+        <w:tc>
+          <w:tcPr>
+            <w:tcW w:w="0" w:type="auto"/>
+            <w:hideMark/>
+          </w:tcPr>
+          <w:p>
+            <w:pPr>
+              <w:spacing w:after="160" w:line="278" w:lineRule="auto"/>
+            </w:pPr>
             <w:r>
               <w:t>Collision Resistant</w:t>
             </w:r>
@@ -1377,10 +1362,12 @@
         <w:tc>
           <w:tcPr>
             <w:tcW w:w="0" w:type="auto"/>
-            <w:vAlign w:val="center"/>
-            <w:hideMark/>
-          </w:tcPr>
-          <w:p>
+            <w:hideMark/>
+          </w:tcPr>
+          <w:p>
+            <w:pPr>
+              <w:spacing w:after="160" w:line="278" w:lineRule="auto"/>
+            </w:pPr>
             <w:r>
               <w:t>Strong</w:t>
             </w:r>
@@ -1388,16 +1375,15 @@
         </w:tc>
       </w:tr>
       <w:tr>
-        <w:trPr>
-          <w:tblCellSpacing w:w="15" w:type="dxa"/>
-        </w:trPr>
-        <w:tc>
-          <w:tcPr>
-            <w:tcW w:w="0" w:type="auto"/>
-            <w:vAlign w:val="center"/>
-            <w:hideMark/>
-          </w:tcPr>
-          <w:p>
+        <w:tc>
+          <w:tcPr>
+            <w:tcW w:w="0" w:type="auto"/>
+            <w:hideMark/>
+          </w:tcPr>
+          <w:p>
+            <w:pPr>
+              <w:spacing w:after="160" w:line="278" w:lineRule="auto"/>
+            </w:pPr>
             <w:r>
               <w:t>Speed</w:t>
             </w:r>
@@ -1406,10 +1392,12 @@
         <w:tc>
           <w:tcPr>
             <w:tcW w:w="0" w:type="auto"/>
-            <w:vAlign w:val="center"/>
-            <w:hideMark/>
-          </w:tcPr>
-          <w:p>
+            <w:hideMark/>
+          </w:tcPr>
+          <w:p>
+            <w:pPr>
+              <w:spacing w:after="160" w:line="278" w:lineRule="auto"/>
+            </w:pPr>
             <w:r>
               <w:t>Fast</w:t>
             </w:r>
@@ -1451,27 +1439,27 @@
           <w:b/>
           <w:bCs/>
         </w:rPr>
+        <w:t>Password Hashing</w:t>
+      </w:r>
+    </w:p>
+    <w:p>
+      <w:r>
+        <w:t>(Usually with bcrypt/Argon2 additionally)</w:t>
+      </w:r>
+    </w:p>
+    <w:p>
+      <w:pPr>
+        <w:rPr>
+          <w:b/>
+          <w:bCs/>
+        </w:rPr>
+      </w:pPr>
+      <w:r>
+        <w:rPr>
+          <w:b/>
+          <w:bCs/>
+        </w:rPr>
         <w:lastRenderedPageBreak/>
-        <w:t>Password Hashing</w:t>
-      </w:r>
-    </w:p>
-    <w:p>
-      <w:r>
-        <w:t>(Usually with bcrypt/Argon2 additionally)</w:t>
-      </w:r>
-    </w:p>
-    <w:p>
-      <w:pPr>
-        <w:rPr>
-          <w:b/>
-          <w:bCs/>
-        </w:rPr>
-      </w:pPr>
-      <w:r>
-        <w:rPr>
-          <w:b/>
-          <w:bCs/>
-        </w:rPr>
         <w:t>SSL/TLS Certificates</w:t>
       </w:r>
     </w:p>
@@ -1547,6 +1535,7 @@
         <w:rPr>
           <w:b/>
           <w:bCs/>
+          <w:highlight w:val="magenta"/>
         </w:rPr>
         <w:t>3. CRC32</w:t>
       </w:r>
@@ -1698,17 +1687,17 @@
         </w:numPr>
       </w:pPr>
       <w:r>
+        <w:t xml:space="preserve">Some bits corrupted </w:t>
+      </w:r>
+    </w:p>
+    <w:p>
+      <w:r>
+        <w:t>CRC helps detect corruption.</w:t>
+      </w:r>
+    </w:p>
+    <w:p>
+      <w:r>
         <w:lastRenderedPageBreak/>
-        <w:t xml:space="preserve">Some bits corrupted </w:t>
-      </w:r>
-    </w:p>
-    <w:p>
-      <w:r>
-        <w:t>CRC helps detect corruption.</w:t>
-      </w:r>
-    </w:p>
-    <w:p>
-      <w:r>
         <w:pict w14:anchorId="464886A5">
           <v:rect id="_x0000_i1191" style="width:0;height:1.5pt" o:hralign="center" o:hrstd="t" o:hr="t" fillcolor="#a0a0a0" stroked="f"/>
         </w:pict>
@@ -1731,33 +1720,23 @@
     </w:p>
     <w:tbl>
       <w:tblPr>
+        <w:tblStyle w:val="TableGrid"/>
         <w:tblW w:w="0" w:type="auto"/>
-        <w:tblCellSpacing w:w="15" w:type="dxa"/>
-        <w:tblCellMar>
-          <w:top w:w="15" w:type="dxa"/>
-          <w:left w:w="15" w:type="dxa"/>
-          <w:bottom w:w="15" w:type="dxa"/>
-          <w:right w:w="15" w:type="dxa"/>
-        </w:tblCellMar>
         <w:tblLook w:val="04A0" w:firstRow="1" w:lastRow="0" w:firstColumn="1" w:lastColumn="0" w:noHBand="0" w:noVBand="1"/>
       </w:tblPr>
       <w:tblGrid>
-        <w:gridCol w:w="1816"/>
-        <w:gridCol w:w="1768"/>
+        <w:gridCol w:w="1957"/>
+        <w:gridCol w:w="1909"/>
       </w:tblGrid>
       <w:tr>
-        <w:trPr>
-          <w:tblHeader/>
-          <w:tblCellSpacing w:w="15" w:type="dxa"/>
-        </w:trPr>
-        <w:tc>
-          <w:tcPr>
-            <w:tcW w:w="0" w:type="auto"/>
-            <w:vAlign w:val="center"/>
-            <w:hideMark/>
-          </w:tcPr>
-          <w:p>
-            <w:pPr>
+        <w:tc>
+          <w:tcPr>
+            <w:tcW w:w="0" w:type="auto"/>
+            <w:hideMark/>
+          </w:tcPr>
+          <w:p>
+            <w:pPr>
+              <w:spacing w:after="160" w:line="278" w:lineRule="auto"/>
               <w:rPr>
                 <w:b/>
                 <w:bCs/>
@@ -1775,11 +1754,11 @@
         <w:tc>
           <w:tcPr>
             <w:tcW w:w="0" w:type="auto"/>
-            <w:vAlign w:val="center"/>
-            <w:hideMark/>
-          </w:tcPr>
-          <w:p>
-            <w:pPr>
+            <w:hideMark/>
+          </w:tcPr>
+          <w:p>
+            <w:pPr>
+              <w:spacing w:after="160" w:line="278" w:lineRule="auto"/>
               <w:rPr>
                 <w:b/>
                 <w:bCs/>
@@ -1796,16 +1775,15 @@
         </w:tc>
       </w:tr>
       <w:tr>
-        <w:trPr>
-          <w:tblCellSpacing w:w="15" w:type="dxa"/>
-        </w:trPr>
-        <w:tc>
-          <w:tcPr>
-            <w:tcW w:w="0" w:type="auto"/>
-            <w:vAlign w:val="center"/>
-            <w:hideMark/>
-          </w:tcPr>
-          <w:p>
+        <w:tc>
+          <w:tcPr>
+            <w:tcW w:w="0" w:type="auto"/>
+            <w:hideMark/>
+          </w:tcPr>
+          <w:p>
+            <w:pPr>
+              <w:spacing w:after="160" w:line="278" w:lineRule="auto"/>
+            </w:pPr>
             <w:r>
               <w:t>ZIP files</w:t>
             </w:r>
@@ -1814,10 +1792,12 @@
         <w:tc>
           <w:tcPr>
             <w:tcW w:w="0" w:type="auto"/>
-            <w:vAlign w:val="center"/>
-            <w:hideMark/>
-          </w:tcPr>
-          <w:p>
+            <w:hideMark/>
+          </w:tcPr>
+          <w:p>
+            <w:pPr>
+              <w:spacing w:after="160" w:line="278" w:lineRule="auto"/>
+            </w:pPr>
             <w:r>
               <w:t>Integrity check</w:t>
             </w:r>
@@ -1825,16 +1805,15 @@
         </w:tc>
       </w:tr>
       <w:tr>
-        <w:trPr>
-          <w:tblCellSpacing w:w="15" w:type="dxa"/>
-        </w:trPr>
-        <w:tc>
-          <w:tcPr>
-            <w:tcW w:w="0" w:type="auto"/>
-            <w:vAlign w:val="center"/>
-            <w:hideMark/>
-          </w:tcPr>
-          <w:p>
+        <w:tc>
+          <w:tcPr>
+            <w:tcW w:w="0" w:type="auto"/>
+            <w:hideMark/>
+          </w:tcPr>
+          <w:p>
+            <w:pPr>
+              <w:spacing w:after="160" w:line="278" w:lineRule="auto"/>
+            </w:pPr>
             <w:r>
               <w:t>Network packets</w:t>
             </w:r>
@@ -1843,10 +1822,12 @@
         <w:tc>
           <w:tcPr>
             <w:tcW w:w="0" w:type="auto"/>
-            <w:vAlign w:val="center"/>
-            <w:hideMark/>
-          </w:tcPr>
-          <w:p>
+            <w:hideMark/>
+          </w:tcPr>
+          <w:p>
+            <w:pPr>
+              <w:spacing w:after="160" w:line="278" w:lineRule="auto"/>
+            </w:pPr>
             <w:r>
               <w:t>Error detection</w:t>
             </w:r>
@@ -1854,16 +1835,15 @@
         </w:tc>
       </w:tr>
       <w:tr>
-        <w:trPr>
-          <w:tblCellSpacing w:w="15" w:type="dxa"/>
-        </w:trPr>
-        <w:tc>
-          <w:tcPr>
-            <w:tcW w:w="0" w:type="auto"/>
-            <w:vAlign w:val="center"/>
-            <w:hideMark/>
-          </w:tcPr>
-          <w:p>
+        <w:tc>
+          <w:tcPr>
+            <w:tcW w:w="0" w:type="auto"/>
+            <w:hideMark/>
+          </w:tcPr>
+          <w:p>
+            <w:pPr>
+              <w:spacing w:after="160" w:line="278" w:lineRule="auto"/>
+            </w:pPr>
             <w:r>
               <w:t>Storage systems</w:t>
             </w:r>
@@ -1872,10 +1852,12 @@
         <w:tc>
           <w:tcPr>
             <w:tcW w:w="0" w:type="auto"/>
-            <w:vAlign w:val="center"/>
-            <w:hideMark/>
-          </w:tcPr>
-          <w:p>
+            <w:hideMark/>
+          </w:tcPr>
+          <w:p>
+            <w:pPr>
+              <w:spacing w:after="160" w:line="278" w:lineRule="auto"/>
+            </w:pPr>
             <w:r>
               <w:t>Data verification</w:t>
             </w:r>
@@ -2082,22 +2064,22 @@
           <w:b/>
           <w:bCs/>
         </w:rPr>
+        <w:t>Encryption</w:t>
+      </w:r>
+    </w:p>
+    <w:p>
+      <w:r>
+        <w:t>Plain Text → Encrypt(Key) → Cipher Text</w:t>
+      </w:r>
+    </w:p>
+    <w:p>
+      <w:r>
+        <w:t>Can decrypt using key.</w:t>
+      </w:r>
+    </w:p>
+    <w:p>
+      <w:r>
         <w:lastRenderedPageBreak/>
-        <w:t>Encryption</w:t>
-      </w:r>
-    </w:p>
-    <w:p>
-      <w:r>
-        <w:t>Plain Text → Encrypt(Key) → Cipher Text</w:t>
-      </w:r>
-    </w:p>
-    <w:p>
-      <w:r>
-        <w:t>Can decrypt using key.</w:t>
-      </w:r>
-    </w:p>
-    <w:p>
-      <w:r>
         <w:pict w14:anchorId="61600FCE">
           <v:rect id="_x0000_i1195" style="width:0;height:1.5pt" o:hralign="center" o:hrstd="t" o:hr="t" fillcolor="#a0a0a0" stroked="f"/>
         </w:pict>
@@ -2774,7 +2756,6 @@
               <w:spacing w:after="160" w:line="278" w:lineRule="auto"/>
             </w:pPr>
             <w:r>
-              <w:lastRenderedPageBreak/>
               <w:t>SHA3</w:t>
             </w:r>
           </w:p>
@@ -2844,6 +2825,7 @@
           <w:b/>
           <w:bCs/>
         </w:rPr>
+        <w:lastRenderedPageBreak/>
         <w:t>Interview-Level Understanding</w:t>
       </w:r>
     </w:p>

</xml_diff>